<commit_message>
Agrega estilo Referencia (sangria francesa, 0pt) y reduce espaciado del cuerpo a 3pt; margenes a 2.0cm; tablas a 8pt
Co-Authored-By: Claude Sonnet 5 <noreply@anthropic.com>
</commit_message>
<xml_diff>
--- a/quarto/plantillas/referencia_etapa1.docx
+++ b/quarto/plantillas/referencia_etapa1.docx
@@ -318,7 +318,7 @@
         <w:numRestart w:val="eachSect"/>
       </w:footnotePr>
       <w:pgSz w:w="12240" w:h="15840"/>
-      <w:pgMar w:top="1417" w:right="1417" w:bottom="1417" w:left="1417" w:header="709" w:footer="709" w:gutter="0"/>
+      <w:pgMar w:top="1134" w:right="1134" w:bottom="1134" w:left="1134" w:header="709" w:footer="709" w:gutter="0"/>
     </w:sectPr>
   </w:body>
 </w:document>
@@ -495,7 +495,7 @@
     </w:rPrDefault>
     <w:pPrDefault>
       <w:pPr>
-        <w:spacing w:after="120" w:line="240" w:lineRule="auto"/>
+        <w:spacing w:after="60" w:line="240" w:lineRule="auto"/>
       </w:pPr>
     </w:pPrDefault>
   </w:docDefaults>
@@ -510,7 +510,16 @@
     <w:link w:val="BodyTextChar"/>
     <w:qFormat/>
     <w:pPr>
-      <w:spacing w:before="60" w:after="120"/>
+      <w:spacing w:before="60" w:after="60"/>
+    </w:pPr>
+  </w:style>
+  <w:style w:type="paragraph" w:customStyle="1" w:styleId="Referencia">
+    <w:name w:val="Referencia"/>
+    <w:basedOn w:val="BodyText"/>
+    <w:qFormat/>
+    <w:pPr>
+      <w:spacing w:before="0" w:after="0"/>
+      <w:ind w:left="720" w:hanging="720"/>
     </w:pPr>
   </w:style>
   <w:style w:type="paragraph" w:customStyle="1" w:styleId="FirstParagraph">
@@ -1022,8 +1031,8 @@
     <w:unhideWhenUsed/>
     <w:qFormat/>
     <w:rPr>
-      <w:sz w:val="18"/>
-      <w:szCs w:val="18"/>
+      <w:sz w:val="16"/>
+      <w:szCs w:val="16"/>
     </w:rPr>
     <w:tblPr>
       <w:tblInd w:w="0" w:type="dxa"/>

</xml_diff>